<commit_message>
Separate Paper 2 methodology repository
</commit_message>
<xml_diff>
--- a/papers/paper1_aas/submission/01_manuscript_AAS.docx
+++ b/papers/paper1_aas/submission/01_manuscript_AAS.docx
@@ -367,7 +367,7 @@
     </w:p>
     <w:p>
       <w:r>
-        <w:t>The Python package exposes a command-line interface, YAML configuration, Parquet/CSV tables, SQLite event trajectories and a local dashboard. `scripts/reproduce_naaj.py` regenerates the fixed applied study; `scripts/reproduce_saj.py` builds the probabilistic extension. A run manifest stores SHA-256 hashes, and `REPRODUCIBILITY.md` gives installation and resource instructions.</w:t>
+        <w:t>The Python package exposes a command-line interface, YAML configuration, Parquet/CSV tables, SQLite event trajectories and a local operational dashboard. `scripts/reproduce_naaj.py` regenerates the fixed applied study. A run manifest stores SHA-256 hashes, and `REPRODUCIBILITY.md` gives installation and resource instructions.</w:t>
       </w:r>
     </w:p>
     <w:p>
@@ -380,7 +380,7 @@
     </w:p>
     <w:p>
       <w:r>
-        <w:t>The test suite checks deterministic seeds, unique run identifiers, six stage records per run, transition probabilities, analytic state recursion, known-parameter recovery and required publication outputs. Nine tests pass in the frozen environment. The smoke profile supports rapid installation checks; the scaled profile recreates the reported 1,024-run study.</w:t>
+        <w:t>The test suite checks deterministic seeds, unique run identifiers, six stage records per run and required publication outputs. The smoke profile supports rapid installation checks; the scaled profile recreates the reported 1,024-run study.</w:t>
       </w:r>
     </w:p>
     <w:p>

</xml_diff>